<commit_message>
Refaz minuta do processo 0800175-38.2025.8.18.0056 estritamente pelo modelo
Mantém apenas os blocos da ROTA 4 + ROTA 7 com o texto fixo do modelo,
preenchendo somente os campos; remove as seções acrescentadas.

Co-Authored-By: Claude Opus 5.5 <noreply@anthropic.com>
Claude-Session: https://claude.ai/code/session_013QDNUXax2KcndW1CBsMGWB
</commit_message>
<xml_diff>
--- a/MINUTA - SENTENCA - 0800175-38.2025.8.18.0056.docx
+++ b/MINUTA - SENTENCA - 0800175-38.2025.8.18.0056.docx
@@ -38,7 +38,7 @@
           <w:color w:val="000000"/>
           <w:sz w:val="24"/>
         </w:rPr>
-        <w:t xml:space="preserve">Trata-se de ação de obrigação de fazer c/c indenização por danos morais e materiais proposta por FLORISMAR MARREIROS DA SILVA, em face de BANCO BRADESCO S.A., pelos motivos expostos na inicial.</w:t>
+        <w:t xml:space="preserve">Trata-se de ação de obrigação de fazer c/c danos morais e materiais proposta por FLORISMAR MARREIROS DA SILVA, em face de BANCO BRADESCO S.A., pelos motivos expostos na inicial.</w:t>
       </w:r>
     </w:p>
     <w:p>
@@ -54,7 +54,7 @@
           <w:color w:val="000000"/>
           <w:sz w:val="24"/>
         </w:rPr>
-        <w:t xml:space="preserve">A parte autora alega na inicial (Id. 70231310), em resumo, que sofre, sem ter contratado, débitos da tarifa “CESTA B.EXPRESSO1” na conta em que recebe seu benefício previdenciário, desde 30/01/2020, no valor de R$ 2.490,59 (Id. 70231316).</w:t>
+        <w:t xml:space="preserve">A parte autora alega na inicial (Id. 70231310), em resumo, que recebe seu benefício previdenciário em conta mantida junto ao réu e que, sem ter contratado, autorizado ou usufruído de qualquer serviço, sofre débitos da tarifa “CESTA B.EXPRESSO1” desde 30/01/2020, em 64 parcelas, no valor de R$ 2.490,59 (planilha de Id. 70231316).</w:t>
       </w:r>
     </w:p>
     <w:p>
@@ -70,7 +70,7 @@
           <w:color w:val="000000"/>
           <w:sz w:val="24"/>
         </w:rPr>
-        <w:t xml:space="preserve">Por isso, requer a conversão da conta em conta benefício ou a cessação dos descontos, a restituição em dobro e indenização por danos morais.</w:t>
+        <w:t xml:space="preserve">Por isso, requer a conversão da conta corrente em conta benefício ou, subsidiariamente, a suspensão dos descontos, a restituição em dobro dos valores descontados e indenização por danos morais no valor de R$ 10.000,00.</w:t>
       </w:r>
     </w:p>
     <w:p>
@@ -86,7 +86,7 @@
           <w:color w:val="000000"/>
           <w:sz w:val="24"/>
         </w:rPr>
-        <w:t xml:space="preserve">Citado, o demandado apresentou contestação (Id. 85161639) alegando, em síntese, que a cesta foi contratada e usufruída, com uso de serviços além dos essenciais; arguiu preliminares, prescrição e abuso do direito de demandar, formulou pedido contraposto e negou o dano moral e a dobra.</w:t>
+        <w:t xml:space="preserve">Citado, o demandado apresentou contestação (Id. 85161639) alegando, em síntese, que a cesta de serviços foi regularmente contratada e utilizada pela parte autora, que realizou operações além dos serviços essenciais, inexistindo ato ilícito, dano moral ou dever de restituição em dobro.</w:t>
       </w:r>
     </w:p>
     <w:p>
@@ -102,23 +102,7 @@
           <w:color w:val="000000"/>
           <w:sz w:val="24"/>
         </w:rPr>
-        <w:t xml:space="preserve">Em réplica (Id. 85241780), a parte autora alegou que o réu não juntou o contrato e que é analfabeta.</w:t>
-      </w:r>
-    </w:p>
-    <w:p>
-      <w:pPr>
-        <w:spacing w:before="0" w:after="0" w:line="360" w:lineRule="auto"/>
-        <w:ind w:firstLine="709" w:left="0"/>
-        <w:jc w:val="both"/>
-      </w:pPr>
-      <w:r>
-        <w:rPr>
-          <w:rFonts w:ascii="Times New Roman" w:hAnsi="Times New Roman"/>
-          <w:b w:val="0"/>
-          <w:color w:val="000000"/>
-          <w:sz w:val="24"/>
-        </w:rPr>
-        <w:t xml:space="preserve">Intimado a comprovar a contratação da cesta (Id. 94365979), o réu declarou não ter outras provas a produzir (Id. 98524079).</w:t>
+        <w:t xml:space="preserve">Em réplica (Id. 85241780), a parte autora alegou que o réu não juntou o contrato de adesão à cesta de serviços e que é pessoa analfabeta.</w:t>
       </w:r>
     </w:p>
     <w:p>
@@ -212,85 +196,7 @@
           <w:color w:val="000000"/>
           <w:sz w:val="24"/>
         </w:rPr>
-        <w:t xml:space="preserve">Da análise dos autos, oportuno o julgamento do processo no estado em que se encontra, sendo desnecessária maior dilação probatória, eis que o acervo probatório é suficiente para o deslinde do feito, nos termos do art. 355, I do CPC. Registre-se que o próprio réu, instado a produzir a prova documental da contratação, requereu o julgamento antecipado (Id. 98524079).</w:t>
-      </w:r>
-    </w:p>
-    <w:p>
-      <w:pPr>
-        <w:spacing w:before="0" w:after="0" w:line="360" w:lineRule="auto"/>
-        <w:ind w:firstLine="0" w:left="0"/>
-        <w:jc w:val="left"/>
-      </w:pPr>
-    </w:p>
-    <w:p>
-      <w:pPr>
-        <w:spacing w:before="0" w:after="0" w:line="360" w:lineRule="auto"/>
-        <w:ind w:firstLine="0" w:left="0"/>
-        <w:jc w:val="left"/>
-      </w:pPr>
-      <w:r>
-        <w:rPr>
-          <w:rFonts w:ascii="Times New Roman" w:hAnsi="Times New Roman"/>
-          <w:b/>
-          <w:color w:val="000000"/>
-          <w:sz w:val="24"/>
-        </w:rPr>
-        <w:t xml:space="preserve">Segredo de justiça</w:t>
-      </w:r>
-    </w:p>
-    <w:p>
-      <w:pPr>
-        <w:spacing w:before="0" w:after="0" w:line="360" w:lineRule="auto"/>
-        <w:ind w:firstLine="709" w:left="0"/>
-        <w:jc w:val="both"/>
-      </w:pPr>
-      <w:r>
-        <w:rPr>
-          <w:rFonts w:ascii="Times New Roman" w:hAnsi="Times New Roman"/>
-          <w:b w:val="0"/>
-          <w:color w:val="000000"/>
-          <w:sz w:val="24"/>
-        </w:rPr>
-        <w:t xml:space="preserve">O réu pede a tramitação do feito em segredo de justiça por ter juntado extratos da conta da parte autora. A publicidade dos atos processuais é a regra (art. 93, IX, da Constituição Federal e art. 189 do CPC), e o sigilo das informações bancárias (Lei Complementar n. 105/2001) resguarda-se suficientemente com a restrição de acesso ao próprio documento. Indefiro, pois, o segredo de justiça do processo e determino a anotação de sigilo no documento de Id. 85161640.</w:t>
-      </w:r>
-    </w:p>
-    <w:p>
-      <w:pPr>
-        <w:spacing w:before="0" w:after="0" w:line="360" w:lineRule="auto"/>
-        <w:ind w:firstLine="0" w:left="0"/>
-        <w:jc w:val="left"/>
-      </w:pPr>
-    </w:p>
-    <w:p>
-      <w:pPr>
-        <w:spacing w:before="0" w:after="0" w:line="360" w:lineRule="auto"/>
-        <w:ind w:firstLine="0" w:left="0"/>
-        <w:jc w:val="left"/>
-      </w:pPr>
-      <w:r>
-        <w:rPr>
-          <w:rFonts w:ascii="Times New Roman" w:hAnsi="Times New Roman"/>
-          <w:b/>
-          <w:color w:val="000000"/>
-          <w:sz w:val="24"/>
-        </w:rPr>
-        <w:t xml:space="preserve">Interesse de agir</w:t>
-      </w:r>
-    </w:p>
-    <w:p>
-      <w:pPr>
-        <w:spacing w:before="0" w:after="0" w:line="360" w:lineRule="auto"/>
-        <w:ind w:firstLine="709" w:left="0"/>
-        <w:jc w:val="both"/>
-      </w:pPr>
-      <w:r>
-        <w:rPr>
-          <w:rFonts w:ascii="Times New Roman" w:hAnsi="Times New Roman"/>
-          <w:b w:val="0"/>
-          <w:color w:val="000000"/>
-          <w:sz w:val="24"/>
-        </w:rPr>
-        <w:t xml:space="preserve">Rejeito a preliminar de falta de interesse de agir. O acesso ao Poder Judiciário independe de prévio requerimento administrativo (art. 5º, XXXV, da Constituição Federal), ressalvadas hipóteses legais específicas, entre as quais não se inclui a presente. Ademais, a própria contestação, ao sustentar a regularidade das cobranças, evidencia a resistência à pretensão.</w:t>
+        <w:t xml:space="preserve">Da análise dos autos, oportuno o julgamento do processo no estado em que se encontra, sendo desnecessária maior dilação probatória, eis que o acervo probatório é suficiente para o deslinde do feito, nos termos do art. 355, I do CPC.</w:t>
       </w:r>
     </w:p>
     <w:p>
@@ -335,22 +241,6 @@
     <w:p>
       <w:pPr>
         <w:spacing w:before="0" w:after="0" w:line="360" w:lineRule="auto"/>
-        <w:ind w:firstLine="709" w:left="0"/>
-        <w:jc w:val="both"/>
-      </w:pPr>
-      <w:r>
-        <w:rPr>
-          <w:rFonts w:ascii="Times New Roman" w:hAnsi="Times New Roman"/>
-          <w:b w:val="0"/>
-          <w:color w:val="000000"/>
-          <w:sz w:val="24"/>
-        </w:rPr>
-        <w:t xml:space="preserve">Ajuizada a ação em 04/02/2025 (Id. 70231310), estão prescritas as parcelas debitadas antes de 04/02/2020. Não prospera a tese de que toda a pretensão estaria fulminada, pois os débitos se renovam mês a mês, em relação de trato sucessivo, nem a de incidência do prazo trienal do art. 206, § 3º, IV, do Código Civil, afastado pela regra especial do art. 27 do CDC.</w:t>
-      </w:r>
-    </w:p>
-    <w:p>
-      <w:pPr>
-        <w:spacing w:before="0" w:after="0" w:line="360" w:lineRule="auto"/>
         <w:ind w:firstLine="0" w:left="0"/>
         <w:jc w:val="left"/>
       </w:pPr>
@@ -384,23 +274,7 @@
           <w:color w:val="000000"/>
           <w:sz w:val="24"/>
         </w:rPr>
-        <w:t xml:space="preserve">Em síntese, afirma a parte autora que a parte demandada debitou, de sua conta, valores de suposta tarifa bancária denominada “CESTA B.EXPRESSO1”, que nunca foi objeto de negócio entre as partes, pelo que pede a cessação das cobranças, a restituição em dobro dos valores descontados indevidamente e indenização pelos danos morais.</w:t>
-      </w:r>
-    </w:p>
-    <w:p>
-      <w:pPr>
-        <w:spacing w:before="0" w:after="0" w:line="360" w:lineRule="auto"/>
-        <w:ind w:firstLine="709" w:left="0"/>
-        <w:jc w:val="both"/>
-      </w:pPr>
-      <w:r>
-        <w:rPr>
-          <w:rFonts w:ascii="Times New Roman" w:hAnsi="Times New Roman"/>
-          <w:b w:val="0"/>
-          <w:color w:val="000000"/>
-          <w:sz w:val="24"/>
-        </w:rPr>
-        <w:t xml:space="preserve">Embora a inicial não formule pedido declaratório autônomo, a inexistência da relação jurídica é pressuposto lógico da cessação das cobranças e da repetição do indébito pretendidas, e assim deve ser compreendida a postulação em seu conjunto (art. 322, § 2º, do CPC).</w:t>
+        <w:t xml:space="preserve">Em síntese, afirma a parte autora que alega que a parte demandada descontou valores de suposta tarifa bancária “CESTA B.EXPRESSO1” que nunca foi objeto de negócio entre as partes, pelo que pede a restituição em dobro dos valores descontados indevidamente e indenização pelos danos morais.</w:t>
       </w:r>
     </w:p>
     <w:p>
@@ -501,7 +375,7 @@
           <w:color w:val="000000"/>
           <w:sz w:val="24"/>
         </w:rPr>
-        <w:t xml:space="preserve">No caso em tela, as relações entre a parte autora e a parte demandada devem ser reguladas, portanto, pelo Código de Defesa do Consumidor.</w:t>
+        <w:t xml:space="preserve">No caso em tela, as relações entre a parte autora e o parte demandada devem ser reguladas, portanto, pelo Código de Defesa do Consumidor.</w:t>
       </w:r>
     </w:p>
     <w:p>
@@ -540,7 +414,7 @@
           <w:color w:val="000000"/>
           <w:sz w:val="24"/>
         </w:rPr>
-        <w:t xml:space="preserve">Com efeito, em causas como a debatida, incumbe à parte demandada a prova da existência do legítimo contrato que justifique os débitos da tarifa na conta em que a parte autora recebe seu benefício previdenciário, mormente em face da inversão do ônus da prova imposta pela hipossuficiência da demandante (art. 6º, VIII, da Lei n. 8.078/90).</w:t>
+        <w:t xml:space="preserve">Com efeito, em causas como a debatida, incumbe à parte demandada a prova da existência do legítimo contrato que justifique os débitos da tarifa “CESTA B.EXPRESSO1” na conta em que a parte autora recebe seu benefício previdenciário, mormente em face da inversão do ônus da prova imposta pela hipossuficiência da demandante (art. 6º, VIII, da Lei n. 8.078/90).</w:t>
       </w:r>
     </w:p>
     <w:p>
@@ -572,7 +446,7 @@
           <w:color w:val="000000"/>
           <w:sz w:val="24"/>
         </w:rPr>
-        <w:t xml:space="preserve">Nessa ótica, considerado invertido o ônus probandi, deveria o demandado juntar aos autos virtuais o instrumento do contrato específico de adesão ao pacote de serviços “CESTA B.EXPRESSO1” (art. 8º da Resolução CMN n. 3.919/2010), com a assinatura das partes, e os documentos pessoais da demandante.</w:t>
+        <w:t xml:space="preserve">Nessa ótica, considerado invertido o ônus probandi, deveria o demandado juntar aos autos virtuais o instrumento do contrato que alega legítimo, com a assinatura das partes, e documentos pessoais da demandante.</w:t>
       </w:r>
     </w:p>
     <w:p>
@@ -596,77 +470,6 @@
           <w:sz w:val="24"/>
         </w:rPr>
         <w:t xml:space="preserve">Nota-se que a parte requerida não juntou aos autos virtuais documentação capaz de comprovar a realização da contratação questionada em juízo, não se desincumbindo do ônus que lhe impõe a atividade probatória nesta seara. Por essas constatações, é imperioso considerar os pedidos da inicial até onde são coerentes com o demonstrado na lide e aplicar a legislação de defesa dos consumidores, bem como a legislação civil brasileira.</w:t>
-      </w:r>
-    </w:p>
-    <w:p>
-      <w:pPr>
-        <w:spacing w:before="0" w:after="0" w:line="360" w:lineRule="auto"/>
-        <w:ind w:firstLine="709" w:left="0"/>
-        <w:jc w:val="both"/>
-      </w:pPr>
-      <w:r>
-        <w:rPr>
-          <w:rFonts w:ascii="Times New Roman" w:hAnsi="Times New Roman"/>
-          <w:b w:val="0"/>
-          <w:color w:val="000000"/>
-          <w:sz w:val="24"/>
-        </w:rPr>
-        <w:t xml:space="preserve">Ressalte-se que o réu não trouxe o instrumento com a contestação, como lhe fora determinado no despacho de Id. 81481638, e, novamente intimado para apresentar documento comprobatório da efetiva contratação do pacote (Ids. 94365979 e 95994128), limitou-se a ratificar a defesa (Id. 98524079). A própria contestação admite que “em alguns casos o contrato não foi localizado” (Id. 85161639, p. 2).</w:t>
-      </w:r>
-    </w:p>
-    <w:p>
-      <w:pPr>
-        <w:spacing w:before="0" w:after="0" w:line="360" w:lineRule="auto"/>
-        <w:ind w:firstLine="0" w:left="0"/>
-        <w:jc w:val="left"/>
-      </w:pPr>
-    </w:p>
-    <w:p>
-      <w:pPr>
-        <w:spacing w:before="0" w:after="0" w:line="360" w:lineRule="auto"/>
-        <w:ind w:firstLine="0" w:left="0"/>
-        <w:jc w:val="left"/>
-      </w:pPr>
-      <w:r>
-        <w:rPr>
-          <w:rFonts w:ascii="Times New Roman" w:hAnsi="Times New Roman"/>
-          <w:b/>
-          <w:color w:val="000000"/>
-          <w:sz w:val="24"/>
-        </w:rPr>
-        <w:t xml:space="preserve">Da utilização da conta e do comportamento da parte autora</w:t>
-      </w:r>
-    </w:p>
-    <w:p>
-      <w:pPr>
-        <w:spacing w:before="0" w:after="0" w:line="360" w:lineRule="auto"/>
-        <w:ind w:firstLine="709" w:left="0"/>
-        <w:jc w:val="both"/>
-      </w:pPr>
-      <w:r>
-        <w:rPr>
-          <w:rFonts w:ascii="Times New Roman" w:hAnsi="Times New Roman"/>
-          <w:b w:val="0"/>
-          <w:color w:val="000000"/>
-          <w:sz w:val="24"/>
-        </w:rPr>
-        <w:t xml:space="preserve">Tampouco socorre o réu a alegação de que a autora utilizou serviços além dos essenciais, notadamente saques acima do limite gratuito, conforme os extratos de Id. 85161640. Nos termos do art. 8º da Resolução CMN n. 3.919/2010, a contratação de pacotes de serviços deve ser realizada mediante contrato específico. O simples uso da conta ou a extrapolação de limites de serviços essenciais não autoriza a migração para pacote tarifado sem anuência expressa (Resolução CMN n. 3.919/2010).</w:t>
-      </w:r>
-    </w:p>
-    <w:p>
-      <w:pPr>
-        <w:spacing w:before="0" w:after="0" w:line="360" w:lineRule="auto"/>
-        <w:ind w:firstLine="709" w:left="0"/>
-        <w:jc w:val="both"/>
-      </w:pPr>
-      <w:r>
-        <w:rPr>
-          <w:rFonts w:ascii="Times New Roman" w:hAnsi="Times New Roman"/>
-          <w:b w:val="0"/>
-          <w:color w:val="000000"/>
-          <w:sz w:val="24"/>
-        </w:rPr>
-        <w:t xml:space="preserve">Pela mesma razão, não há falar em venire contra factum proprium nem em violação ao duty to mitigate the loss. O serviço fornecido sem solicitação prévia não gera obrigação de pagamento (art. 39, III e parágrafo único, do CDC), e a demora do consumidor em reclamar não convalida cobrança desprovida de causa, sujeitando-se apenas ao prazo prescricional já reconhecido.</w:t>
       </w:r>
     </w:p>
     <w:p>
@@ -728,178 +531,6 @@
           <w:color w:val="000000"/>
           <w:sz w:val="24"/>
         </w:rPr>
-        <w:t xml:space="preserve">Da forma da restituição</w:t>
-      </w:r>
-    </w:p>
-    <w:p>
-      <w:pPr>
-        <w:spacing w:before="0" w:after="0" w:line="360" w:lineRule="auto"/>
-        <w:ind w:firstLine="709" w:left="0"/>
-        <w:jc w:val="both"/>
-      </w:pPr>
-      <w:r>
-        <w:rPr>
-          <w:rFonts w:ascii="Times New Roman" w:hAnsi="Times New Roman"/>
-          <w:b w:val="0"/>
-          <w:color w:val="000000"/>
-          <w:sz w:val="24"/>
-        </w:rPr>
-        <w:t xml:space="preserve">A Corte Especial do STJ, no julgamento do EAREsp 676.608/RS, firmou a tese de que a restituição em dobro do indébito (parágrafo único do art. 42 do CDC) independe da natureza do elemento volitivo do fornecedor que cobrou valor indevido, revelando-se cabível quando a cobrança indevida consubstanciar conduta contrária à boa-fé objetiva. Na mesma oportunidade, modulou os efeitos da tese, para os contratos de consumo que não envolvam serviços públicos, aos indébitos cobrados após a publicação do acórdão, ocorrida em 30/03/2021.</w:t>
-      </w:r>
-    </w:p>
-    <w:p>
-      <w:pPr>
-        <w:spacing w:before="0" w:after="0" w:line="360" w:lineRule="auto"/>
-        <w:ind w:firstLine="709" w:left="0"/>
-        <w:jc w:val="both"/>
-      </w:pPr>
-      <w:r>
-        <w:rPr>
-          <w:rFonts w:ascii="Times New Roman" w:hAnsi="Times New Roman"/>
-          <w:b w:val="0"/>
-          <w:color w:val="000000"/>
-          <w:sz w:val="24"/>
-        </w:rPr>
-        <w:t xml:space="preserve">Assim, acolho em parte o pedido subsidiário do réu: a restituição será em dobro quanto aos débitos efetuados a partir de 30/03/2021 e simples quanto aos anteriores não prescritos, à míngua de prova de má-fé em relação a estes. A restituição abrange, ainda, os débitos lançados no curso do processo (art. 323 do CPC), a exemplo dos registrados no extrato de Id. 85161640 após o ajuizamento.</w:t>
-      </w:r>
-    </w:p>
-    <w:p>
-      <w:pPr>
-        <w:spacing w:before="0" w:after="0" w:line="360" w:lineRule="auto"/>
-        <w:ind w:firstLine="0" w:left="0"/>
-        <w:jc w:val="left"/>
-      </w:pPr>
-    </w:p>
-    <w:p>
-      <w:pPr>
-        <w:spacing w:before="0" w:after="0" w:line="360" w:lineRule="auto"/>
-        <w:ind w:firstLine="0" w:left="0"/>
-        <w:jc w:val="left"/>
-      </w:pPr>
-      <w:r>
-        <w:rPr>
-          <w:rFonts w:ascii="Times New Roman" w:hAnsi="Times New Roman"/>
-          <w:b/>
-          <w:color w:val="000000"/>
-          <w:sz w:val="24"/>
-        </w:rPr>
-        <w:t xml:space="preserve">Da obrigação de fazer</w:t>
-      </w:r>
-    </w:p>
-    <w:p>
-      <w:pPr>
-        <w:spacing w:before="0" w:after="0" w:line="360" w:lineRule="auto"/>
-        <w:ind w:firstLine="709" w:left="0"/>
-        <w:jc w:val="both"/>
-      </w:pPr>
-      <w:r>
-        <w:rPr>
-          <w:rFonts w:ascii="Times New Roman" w:hAnsi="Times New Roman"/>
-          <w:b w:val="0"/>
-          <w:color w:val="000000"/>
-          <w:sz w:val="24"/>
-        </w:rPr>
-        <w:t xml:space="preserve">A parte autora pede a conversão de sua conta corrente em conta benefício ou, subsidiariamente, providência que assegure resultado prático equivalente (art. 84 do CDC). A conversão da conta em outra modalidade, todavia, depende de regras próprias e alcançaria contratos de crédito vinculados à conta (Ids. 70231311 e 85161640), não discutidos nestes autos. O resultado prático buscado, que é a cessação das cobranças, é alcançado pelo cancelamento da cesta de serviços, permanecendo a parte autora com os serviços essenciais gratuitos do art. 2º da Resolução CMN n. 3.919/2010. Acolho, pois, o pedido subsidiário.</w:t>
-      </w:r>
-    </w:p>
-    <w:p>
-      <w:pPr>
-        <w:spacing w:before="0" w:after="0" w:line="360" w:lineRule="auto"/>
-        <w:ind w:firstLine="0" w:left="0"/>
-        <w:jc w:val="left"/>
-      </w:pPr>
-    </w:p>
-    <w:p>
-      <w:pPr>
-        <w:spacing w:before="0" w:after="0" w:line="360" w:lineRule="auto"/>
-        <w:ind w:firstLine="0" w:left="0"/>
-        <w:jc w:val="left"/>
-      </w:pPr>
-      <w:r>
-        <w:rPr>
-          <w:rFonts w:ascii="Times New Roman" w:hAnsi="Times New Roman"/>
-          <w:b/>
-          <w:color w:val="000000"/>
-          <w:sz w:val="24"/>
-        </w:rPr>
-        <w:t xml:space="preserve">Pedido contraposto</w:t>
-      </w:r>
-    </w:p>
-    <w:p>
-      <w:pPr>
-        <w:spacing w:before="0" w:after="0" w:line="360" w:lineRule="auto"/>
-        <w:ind w:firstLine="709" w:left="0"/>
-        <w:jc w:val="both"/>
-      </w:pPr>
-      <w:r>
-        <w:rPr>
-          <w:rFonts w:ascii="Times New Roman" w:hAnsi="Times New Roman"/>
-          <w:b w:val="0"/>
-          <w:color w:val="000000"/>
-          <w:sz w:val="24"/>
-        </w:rPr>
-        <w:t xml:space="preserve">Não conheço do pedido de condenação da autora ao pagamento das tarifas avulsas das operações realizadas nos últimos cinco anos. No procedimento comum, a pretensão do réu contra o autor deduz-se por reconvenção (art. 343 do CPC), com os requisitos que lhe são próprios, e o pedido, além disso, é genérico, sem indicação das operações e dos valores, remetidos a planilha a ser apresentada “quando da execução”, em desacordo com o art. 324 do CPC.</w:t>
-      </w:r>
-    </w:p>
-    <w:p>
-      <w:pPr>
-        <w:spacing w:before="0" w:after="0" w:line="360" w:lineRule="auto"/>
-        <w:ind w:firstLine="0" w:left="0"/>
-        <w:jc w:val="left"/>
-      </w:pPr>
-    </w:p>
-    <w:p>
-      <w:pPr>
-        <w:spacing w:before="0" w:after="0" w:line="360" w:lineRule="auto"/>
-        <w:ind w:firstLine="0" w:left="0"/>
-        <w:jc w:val="left"/>
-      </w:pPr>
-      <w:r>
-        <w:rPr>
-          <w:rFonts w:ascii="Times New Roman" w:hAnsi="Times New Roman"/>
-          <w:b/>
-          <w:color w:val="000000"/>
-          <w:sz w:val="24"/>
-        </w:rPr>
-        <w:t xml:space="preserve">Abuso do direito de demandar e litigância de má-fé</w:t>
-      </w:r>
-    </w:p>
-    <w:p>
-      <w:pPr>
-        <w:spacing w:before="0" w:after="0" w:line="360" w:lineRule="auto"/>
-        <w:ind w:firstLine="709" w:left="0"/>
-        <w:jc w:val="both"/>
-      </w:pPr>
-      <w:r>
-        <w:rPr>
-          <w:rFonts w:ascii="Times New Roman" w:hAnsi="Times New Roman"/>
-          <w:b w:val="0"/>
-          <w:color w:val="000000"/>
-          <w:sz w:val="24"/>
-        </w:rPr>
-        <w:t xml:space="preserve">Rejeito a alegação. A parte autora exerceu regularmente o direito de ação, e o acolhimento dos pedidos afasta, por si, a tese de aventura jurídica. Quanto ao alegado fracionamento, a certidão de Id. 70235779 aponta outra demanda entre as mesmas partes (processo n. 0800177-08.2025.8.18.0056), mas não há nos autos elemento que demonstre identidade de objeto, e a cobrança da tarifa de cesta de serviços constitui causa de pedir própria. Não se configura, assim, qualquer das hipóteses do art. 80 do CPC.</w:t>
-      </w:r>
-    </w:p>
-    <w:p>
-      <w:pPr>
-        <w:spacing w:before="0" w:after="0" w:line="360" w:lineRule="auto"/>
-        <w:ind w:firstLine="0" w:left="0"/>
-        <w:jc w:val="left"/>
-      </w:pPr>
-    </w:p>
-    <w:p>
-      <w:pPr>
-        <w:spacing w:before="0" w:after="0" w:line="360" w:lineRule="auto"/>
-        <w:ind w:firstLine="0" w:left="0"/>
-        <w:jc w:val="left"/>
-      </w:pPr>
-      <w:r>
-        <w:rPr>
-          <w:rFonts w:ascii="Times New Roman" w:hAnsi="Times New Roman"/>
-          <w:b/>
-          <w:color w:val="000000"/>
-          <w:sz w:val="24"/>
-        </w:rPr>
         <w:t xml:space="preserve">Danos morais</w:t>
       </w:r>
     </w:p>
@@ -916,7 +547,7 @@
           <w:color w:val="000000"/>
           <w:sz w:val="24"/>
         </w:rPr>
-        <w:t xml:space="preserve">Do que se encontra comprovado nos autos, considero que a parte demandante também merece amparo no que concerne ao pedido de condenação por danos morais. Realmente, ao proceder aos descontos indevidos e não autorizados no valor do benefício previdenciário da parte autora, a instituição financeira ré produziu danos à dignidade da pessoa idosa (nascida em 22/02/1948, conforme documento de identidade de Id. 70231317), privando-a dos poucos valores de que dispõe para a manutenção de sua vida, já fragilizada pelo decurso inexorável do tempo e pela hipossuficiência econômica.</w:t>
+        <w:t xml:space="preserve">Do que se encontra comprovado nos autos, considero que a parte demandante também merece amparo no que concerne ao pedido de condenação por danos morais. Realmente, ao proceder aos descontos indevidos e não autorizados no valor do benefício previdenciário da parte autora, a instituição financeira ré produziu danos à dignidade da pessoa idosa, privando-a dos poucos valores de que dispõe para a manutenção de sua vida, já fragilizada pelo decurso inexorável do tempo e pela hipossuficiência econômica.</w:t>
       </w:r>
     </w:p>
     <w:p>
@@ -948,7 +579,7 @@
           <w:color w:val="000000"/>
           <w:sz w:val="24"/>
         </w:rPr>
-        <w:t xml:space="preserve">Demonstrada a ilicitude dos débitos da tarifa na conta em que a parte autora recebe seus proventos, mormente pela juntada de documento, comprovado o dano e o nexo de causalidade, resta apenas quantificar o valor da indenização.</w:t>
+        <w:t xml:space="preserve">Demonstrada a ilicitude dos descontos nos proventos da parte autora, mormente pela juntada de documento, comprovado o dano e o nexo de causalidade, resta apenas quantificar o valor da indenização.</w:t>
       </w:r>
     </w:p>
     <w:p>
@@ -1018,22 +649,6 @@
     <w:p>
       <w:pPr>
         <w:spacing w:before="0" w:after="0" w:line="360" w:lineRule="auto"/>
-        <w:ind w:firstLine="709" w:left="0"/>
-        <w:jc w:val="both"/>
-      </w:pPr>
-      <w:r>
-        <w:rPr>
-          <w:rFonts w:ascii="Times New Roman" w:hAnsi="Times New Roman"/>
-          <w:b w:val="0"/>
-          <w:color w:val="000000"/>
-          <w:sz w:val="24"/>
-        </w:rPr>
-        <w:t xml:space="preserve">Afasto o pedido do réu de fixação dos juros de mora a partir do arbitramento: inexistente relação contratual válida, a responsabilidade é extracontratual, e os juros fluem do evento danoso (art. 398 do CC e Súmula 54 do STJ).</w:t>
-      </w:r>
-    </w:p>
-    <w:p>
-      <w:pPr>
-        <w:spacing w:before="0" w:after="0" w:line="360" w:lineRule="auto"/>
         <w:ind w:firstLine="0" w:left="0"/>
         <w:jc w:val="left"/>
       </w:pPr>
@@ -1074,23 +689,7 @@
           <w:color w:val="000000"/>
           <w:sz w:val="24"/>
         </w:rPr>
-        <w:t xml:space="preserve">Pelo exposto, com fundamento nos arts. 186 e 927 do CC, nos arts. 6º, VIII, e 14 do CDC, c/c o art. 487, I, do CPC, JULGO PARCIALMENTE PROCEDENTES os pedidos para declarar inexistente a relação jurídica quanto à tarifa “CESTA B.EXPRESSO1” e inexigível o débito dela decorrente, e condenar a parte demandada a restituir os valores debitados a esse título da conta da parte autora, na forma simples os debitados até 29/03/2021 e em dobro os debitados a partir de 30/03/2021, inclusive os debitados no curso do processo, cessando de imediato as cobranças e cancelando a cesta de serviços, mantidos os serviços essenciais gratuitos do art. 2º da Resolução CMN n. 3.919/2010.</w:t>
-      </w:r>
-    </w:p>
-    <w:p>
-      <w:pPr>
-        <w:spacing w:before="0" w:after="0" w:line="360" w:lineRule="auto"/>
-        <w:ind w:firstLine="709" w:left="0"/>
-        <w:jc w:val="both"/>
-      </w:pPr>
-      <w:r>
-        <w:rPr>
-          <w:rFonts w:ascii="Times New Roman" w:hAnsi="Times New Roman"/>
-          <w:b w:val="0"/>
-          <w:color w:val="000000"/>
-          <w:sz w:val="24"/>
-        </w:rPr>
-        <w:t xml:space="preserve">Rejeito a preliminar de falta de interesse de agir, indefiro o segredo de justiça do processo, anotado o sigilo do documento de Id. 85161640, não conheço do pedido contraposto e indefiro o pedido de condenação da parte autora por litigância de má-fé.</w:t>
+        <w:t xml:space="preserve">Pelo exposto, com fundamento nos arts. 186 e 927 do CC, nos arts. 6º, VIII, e 14 do CDC, c/c o art. 487, I, do CPC, JULGO PROCEDENTES os pedidos para declarar inexistente a relação jurídica quanto à tarifa “CESTA B.EXPRESSO1” e inexigível o débito dela decorrente, e condenar a parte demandada a restituir em dobro os valores debitados da conta da parte autora, cessando de imediato as cobranças e cancelando a cesta de serviços.</w:t>
       </w:r>
     </w:p>
     <w:p>
@@ -1177,7 +776,7 @@
           <w:color w:val="000000"/>
           <w:sz w:val="24"/>
         </w:rPr>
-        <w:t xml:space="preserve">Tendo a parte autora decaído de parte mínima do pedido (art. 86, parágrafo único, do CPC), custas pela parte demandada. Fixo honorários em 10% (dez por cento) sobre o valor da condenação.</w:t>
+        <w:t xml:space="preserve">Custas pela parte demandada. Fixo honorários em 10% (dez por cento) sobre o valor da condenação.</w:t>
       </w:r>
     </w:p>
     <w:p>

</xml_diff>

<commit_message>
Corrige erros de digitação no modelo universal e na minuta
- "afirma a parte autora que alega que" -> "afirma a parte autora que"
- "o parte demandada" -> "a parte demandada"

Co-Authored-By: Claude Opus 5.5 <noreply@anthropic.com>
Claude-Session: https://claude.ai/code/session_013QDNUXax2KcndW1CBsMGWB
</commit_message>
<xml_diff>
--- a/MINUTA - SENTENCA - 0800175-38.2025.8.18.0056.docx
+++ b/MINUTA - SENTENCA - 0800175-38.2025.8.18.0056.docx
@@ -274,7 +274,7 @@
           <w:color w:val="000000"/>
           <w:sz w:val="24"/>
         </w:rPr>
-        <w:t xml:space="preserve">Em síntese, afirma a parte autora que alega que a parte demandada descontou valores de suposta tarifa bancária “CESTA B.EXPRESSO1” que nunca foi objeto de negócio entre as partes, pelo que pede a restituição em dobro dos valores descontados indevidamente e indenização pelos danos morais.</w:t>
+        <w:t xml:space="preserve">Em síntese, afirma a parte autora que a parte demandada descontou valores de suposta tarifa bancária “CESTA B.EXPRESSO1” que nunca foi objeto de negócio entre as partes, pelo que pede a restituição em dobro dos valores descontados indevidamente e indenização pelos danos morais.</w:t>
       </w:r>
     </w:p>
     <w:p>
@@ -375,7 +375,7 @@
           <w:color w:val="000000"/>
           <w:sz w:val="24"/>
         </w:rPr>
-        <w:t xml:space="preserve">No caso em tela, as relações entre a parte autora e o parte demandada devem ser reguladas, portanto, pelo Código de Defesa do Consumidor.</w:t>
+        <w:t xml:space="preserve">No caso em tela, as relações entre a parte autora e a parte demandada devem ser reguladas, portanto, pelo Código de Defesa do Consumidor.</w:t>
       </w:r>
     </w:p>
     <w:p>

</xml_diff>